<commit_message>
polishing up writeup, readme, presentation for final deadline
</commit_message>
<xml_diff>
--- a/balatro_writeup.docx
+++ b/balatro_writeup.docx
@@ -2042,23 +2042,15 @@
         <w:pStyle w:val="Heading2"/>
       </w:pPr>
       <w:r>
-        <w:t xml:space="preserve">Q2: Is RL hunting rational or panic-driven?</w:t>
-      </w:r>
-    </w:p>
-    <w:p>
-      <w:pPr>
-        <w:spacing w:after="160"/>
-      </w:pPr>
-      <w:r>
-        <w:t xml:space="preserve">We defined a hunt as two or more consecutive discards followed immediately by a play. Across RL’s 177 winning games, flush and straight were the overwhelmingly dominant hunt targets.</w:t>
-      </w:r>
-    </w:p>
-    <w:p>
-      <w:pPr>
-        <w:spacing w:after="160"/>
-      </w:pPr>
-      <w:r>
-        <w:t xml:space="preserve">Crucially, we asked: does the hunt success rate depend on chip pressure? We split hunts into "comfortable" (chips_scored &gt; 50% of chips_needed at hunt start) and "desperate" (chips_scored ≤ 50%). The success rate was 57% when comfortable and 56% when desperate — essentially identical. This tells us the agent is not panic-discarding when it’s behind. It hunts when it sees the cards for a flush or straight in the remaining deck, not when it feels pressure. That is principled behavior.</w:t>
+        <w:t xml:space="preserve">Q2: What does the bot hunt for?</w:t>
+      </w:r>
+    </w:p>
+    <w:p>
+      <w:pPr>
+        <w:spacing w:after="160"/>
+      </w:pPr>
+      <w:r>
+        <w:t xml:space="preserve">We defined a hunt as two or more consecutive discards followed immediately by a play. Across RL’s 177 winning games there were 346 multi-discard hunts. The outcome distribution is dominated by flush (136 hunts, 39%), followed by two_pair (62), pair (52), and straight (42). When the bot commits to a hunt, it lands a premium hand (flush, straight, full house, or better) roughly 56% of the time. The remaining hunts end in a pair or two_pair — the bot tried for something better but settled for what the deck gave it. This is a limitation of our intent-detection method: we infer intent from the hand played after the hunt, but when the bot hunts and fails to find its target it still has to play something, so the post-hunt hand underestimates how often the bot was aiming for premium hands.</w:t>
       </w:r>
     </w:p>
     <w:p>
@@ -2120,15 +2112,15 @@
         <w:pStyle w:val="Heading2"/>
       </w:pPr>
       <w:r>
-        <w:t xml:space="preserve">Q4: Is aggressive hunting worth it?</w:t>
-      </w:r>
-    </w:p>
-    <w:p>
-      <w:pPr>
-        <w:spacing w:after="160"/>
-      </w:pPr>
-      <w:r>
-        <w:t xml:space="preserve">Within RL’s winning games, we split games by discard intensity: aggressive (average &gt; 1 discard per blind) vs. conservative. Aggressive games cleared with 25% more chip margin (+121 chips above target vs. +97 for conservative) and had a higher premium hand rate. This validates the core strategy: if you have the discards available and the deck composition supports it, hunting is worth it. The RL agent learned this from 500 episodes of self-play, without any hand-crafted rule to this effect.</w:t>
+        <w:t xml:space="preserve">Q4: What’s the human takeaway?</w:t>
+      </w:r>
+    </w:p>
+    <w:p>
+      <w:pPr>
+        <w:spacing w:after="160"/>
+      </w:pPr>
+      <w:r>
+        <w:t xml:space="preserve">The combined evidence from Q1–Q3 suggests a concrete heuristic for human play: not flush-or-bust. Rather than discarding a two pair to chase a flush from scratch, play the two pair to bank safe chips, then spend remaining discards hunting for a flush or other premium hand. The RL agent’s dominant bigram (two_pair → flush) encodes exactly this pattern — and the scripted bot’s lower win rate despite a higher premium hand rate shows that over-hunting is counterproductive. Patience and sequencing matter more than raw hand quality.</w:t>
       </w:r>
     </w:p>
     <w:p>
@@ -2149,7 +2141,33 @@
         <w:spacing w:after="160"/>
       </w:pPr>
       <w:r>
-        <w:t xml:space="preserve">The agent has clear failure modes:</w:t>
+        <w:t xml:space="preserve">The agent and the analysis have clear limitations:</w:t>
+      </w:r>
+    </w:p>
+    <w:p>
+      <w:pPr>
+        <w:pStyle w:val="ListParagraph"/>
+        <w:numPr>
+          <w:ilvl w:val="0"/>
+          <w:numId w:val="2"/>
+        </w:numPr>
+        <w:spacing w:after="80"/>
+      </w:pPr>
+      <w:r>
+        <w:t xml:space="preserve">The trace analysis conditions only on winning games, which introduces survivorship bias. Patterns observed in wins may not distinguish winning from losing behavior — the same two_pair → flush pattern might appear in losses too, just with worse luck on the draw. Analyzing losses would let us identify what to avoid and would test whether the patterns we found are genuinely predictive of success or just common across all games.</w:t>
+      </w:r>
+    </w:p>
+    <w:p>
+      <w:pPr>
+        <w:pStyle w:val="ListParagraph"/>
+        <w:numPr>
+          <w:ilvl w:val="0"/>
+          <w:numId w:val="2"/>
+        </w:numPr>
+        <w:spacing w:after="80"/>
+      </w:pPr>
+      <w:r>
+        <w:t xml:space="preserve">The bigram analysis is discard-agnostic — it only looks at the sequence of hand types played, ignoring what was discarded between plays. A discard-aware analysis that distinguishes traces by what was thrown away (not just what was kept) would give a richer picture of agent strategy.</w:t>
       </w:r>
     </w:p>
     <w:p>

</xml_diff>